<commit_message>
chore(fixtures): Office-Metadaten der Beispieldateien aufgeraeumt
Druckerprofile, customXml-Teile, Pfadangabe und Bearbeitervermerk
entfernt; Blaetter, Zellen, Formeln, VBA und Dokumenttext unveraendert
(nachgewiesen ueber Wert-, Formel- und Namensvergleich). Suite gruen.

Generated with Claude Code
</commit_message>
<xml_diff>
--- a/lieferungen/baldrian/Mitteilung_143_KLV_TG2015.docx
+++ b/lieferungen/baldrian/Mitteilung_143_KLV_TG2015.docx
@@ -46131,224 +46131,4 @@
     </a:ext>
   </a:extLst>
 </a:theme>
-</file>
-
-<file path=customXml/item1.xml><?xml version="1.0" encoding="utf-8"?>
-<b:Sources xmlns:b="http://schemas.openxmlformats.org/officeDocument/2006/bibliography" xmlns="http://schemas.openxmlformats.org/officeDocument/2006/bibliography" SelectedStyle="\APASixthEditionOfficeOnline.xsl" StyleName="APA" Version="6"/>
-</file>
-
-<file path=customXml/item2.xml><?xml version="1.0" encoding="utf-8"?>
-<?mso-contentType ?>
-<FormTemplates xmlns="http://schemas.microsoft.com/sharepoint/v3/contenttype/forms">
-  <Display>DocumentLibraryForm</Display>
-  <Edit>DocumentLibraryForm</Edit>
-  <New>DocumentLibraryForm</New>
-</FormTemplates>
-</file>
-
-<file path=customXml/item3.xml><?xml version="1.0" encoding="utf-8"?>
-<p:properties xmlns:p="http://schemas.microsoft.com/office/2006/metadata/properties" xmlns:xsi="http://www.w3.org/2001/XMLSchema-instance" xmlns:pc="http://schemas.microsoft.com/office/infopath/2007/PartnerControls">
-  <documentManagement>
-    <Kategorie xmlns="7e148860-bd70-402c-bf27-c74ddf478b75">White-Box-Modelle</Kategorie>
-    <PublishingExpirationDate xmlns="http://schemas.microsoft.com/sharepoint/v3" xsi:nil="true"/>
-    <PublishingStartDate xmlns="http://schemas.microsoft.com/sharepoint/v3" xsi:nil="true"/>
-  </documentManagement>
-</p:properties>
-</file>
-
-<file path=customXml/item4.xml><?xml version="1.0" encoding="utf-8"?>
-<ct:contentTypeSchema xmlns:ct="http://schemas.microsoft.com/office/2006/metadata/contentType" xmlns:ma="http://schemas.microsoft.com/office/2006/metadata/properties/metaAttributes" ct:_="" ma:_="" ma:contentTypeName="Dokument" ma:contentTypeID="0x0101009670652FF643BB4087D0D4458642B0D2" ma:contentTypeVersion="4" ma:contentTypeDescription="Ein neues Dokument erstellen." ma:contentTypeScope="" ma:versionID="97ec7617939de4e5f17fc07f9f160333">
-  <xsd:schema xmlns:xsd="http://www.w3.org/2001/XMLSchema" xmlns:xs="http://www.w3.org/2001/XMLSchema" xmlns:p="http://schemas.microsoft.com/office/2006/metadata/properties" xmlns:ns1="http://schemas.microsoft.com/sharepoint/v3" xmlns:ns2="7e148860-bd70-402c-bf27-c74ddf478b75" targetNamespace="http://schemas.microsoft.com/office/2006/metadata/properties" ma:root="true" ma:fieldsID="899ced930f44085f47fb482023dc2c48" ns1:_="" ns2:_="">
-    <xsd:import namespace="http://schemas.microsoft.com/sharepoint/v3"/>
-    <xsd:import namespace="7e148860-bd70-402c-bf27-c74ddf478b75"/>
-    <xsd:element name="properties">
-      <xsd:complexType>
-        <xsd:sequence>
-          <xsd:element name="documentManagement">
-            <xsd:complexType>
-              <xsd:all>
-                <xsd:element ref="ns1:PublishingStartDate" minOccurs="0"/>
-                <xsd:element ref="ns1:PublishingExpirationDate" minOccurs="0"/>
-                <xsd:element ref="ns2:Kategorie"/>
-              </xsd:all>
-            </xsd:complexType>
-          </xsd:element>
-        </xsd:sequence>
-      </xsd:complexType>
-    </xsd:element>
-  </xsd:schema>
-  <xsd:schema xmlns:xsd="http://www.w3.org/2001/XMLSchema" xmlns:xs="http://www.w3.org/2001/XMLSchema" xmlns:dms="http://schemas.microsoft.com/office/2006/documentManagement/types" xmlns:pc="http://schemas.microsoft.com/office/infopath/2007/PartnerControls" targetNamespace="http://schemas.microsoft.com/sharepoint/v3" elementFormDefault="qualified">
-    <xsd:import namespace="http://schemas.microsoft.com/office/2006/documentManagement/types"/>
-    <xsd:import namespace="http://schemas.microsoft.com/office/infopath/2007/PartnerControls"/>
-    <xsd:element name="PublishingStartDate" ma:index="8" nillable="true" ma:displayName="Geplantes Startdatum" ma:description="Geplantes Startdatum ist eine Websitespalte, die über das Feature zum Veröffentlichen erstellt wird. Es wird zur Angabe des Datums und der Uhrzeit verwendet, wann diese Seite Besuchern zum ersten Mal angezeigt wird." ma:hidden="true" ma:internalName="PublishingStartDate">
-      <xsd:simpleType>
-        <xsd:restriction base="dms:Unknown"/>
-      </xsd:simpleType>
-    </xsd:element>
-    <xsd:element name="PublishingExpirationDate" ma:index="9" nillable="true" ma:displayName="Geplantes Enddatum" ma:description="Geplantes Enddatum ist eine Websitespalte, die über das Feature zum Veröffentlichen erstellt wird. Es wird zur Angabe des Datums und der Uhrzeit verwendet, wann diese Seite Besuchern nicht mehr angezeigt wird." ma:hidden="true" ma:internalName="PublishingExpirationDate">
-      <xsd:simpleType>
-        <xsd:restriction base="dms:Unknown"/>
-      </xsd:simpleType>
-    </xsd:element>
-  </xsd:schema>
-  <xsd:schema xmlns:xsd="http://www.w3.org/2001/XMLSchema" xmlns:xs="http://www.w3.org/2001/XMLSchema" xmlns:dms="http://schemas.microsoft.com/office/2006/documentManagement/types" xmlns:pc="http://schemas.microsoft.com/office/infopath/2007/PartnerControls" targetNamespace="7e148860-bd70-402c-bf27-c74ddf478b75" elementFormDefault="qualified">
-    <xsd:import namespace="http://schemas.microsoft.com/office/2006/documentManagement/types"/>
-    <xsd:import namespace="http://schemas.microsoft.com/office/infopath/2007/PartnerControls"/>
-    <xsd:element name="Kategorie" ma:index="10" ma:displayName="Kategorie" ma:default="Aktuell in Bearbeitung" ma:format="Dropdown" ma:internalName="Kategorie">
-      <xsd:simpleType>
-        <xsd:union memberTypes="dms:Text">
-          <xsd:simpleType>
-            <xsd:restriction base="dms:Choice">
-              <xsd:enumeration value="Aktuell in Bearbeitung"/>
-              <xsd:enumeration value="Verabschiedete Arbeitsergebnisse"/>
-              <xsd:enumeration value="Nützliche Dokumente"/>
-            </xsd:restriction>
-          </xsd:simpleType>
-        </xsd:union>
-      </xsd:simpleType>
-    </xsd:element>
-  </xsd:schema>
-  <xsd:schema xmlns="http://schemas.openxmlformats.org/package/2006/metadata/core-properties" xmlns:xsd="http://www.w3.org/2001/XMLSchema" xmlns:xsi="http://www.w3.org/2001/XMLSchema-instance" xmlns:dc="http://purl.org/dc/elements/1.1/" xmlns:dcterms="http://purl.org/dc/terms/" xmlns:odoc="http://schemas.microsoft.com/internal/obd" targetNamespace="http://schemas.openxmlformats.org/package/2006/metadata/core-properties" elementFormDefault="qualified" attributeFormDefault="unqualified" blockDefault="#all">
-    <xsd:import namespace="http://purl.org/dc/elements/1.1/" schemaLocation="http://dublincore.org/schemas/xmls/qdc/2003/04/02/dc.xsd"/>
-    <xsd:import namespace="http://purl.org/dc/terms/" schemaLocation="http://dublincore.org/schemas/xmls/qdc/2003/04/02/dcterms.xsd"/>
-    <xsd:element name="coreProperties" type="CT_coreProperties"/>
-    <xsd:complexType name="CT_coreProperties">
-      <xsd:all>
-        <xsd:element ref="dc:creator" minOccurs="0" maxOccurs="1"/>
-        <xsd:element ref="dcterms:created" minOccurs="0" maxOccurs="1"/>
-        <xsd:element ref="dc:identifier" minOccurs="0" maxOccurs="1"/>
-        <xsd:element name="contentType" minOccurs="0" maxOccurs="1" type="xsd:string" ma:index="0" ma:displayName="Inhaltstyp"/>
-        <xsd:element ref="dc:title" minOccurs="0" maxOccurs="1" ma:index="4" ma:displayName="Titel"/>
-        <xsd:element ref="dc:subject" minOccurs="0" maxOccurs="1"/>
-        <xsd:element ref="dc:description" minOccurs="0" maxOccurs="1"/>
-        <xsd:element name="keywords" minOccurs="0" maxOccurs="1" type="xsd:string"/>
-        <xsd:element ref="dc:language" minOccurs="0" maxOccurs="1"/>
-        <xsd:element name="category" minOccurs="0" maxOccurs="1" type="xsd:string"/>
-        <xsd:element name="version" minOccurs="0" maxOccurs="1" type="xsd:string"/>
-        <xsd:element name="revision" minOccurs="0" maxOccurs="1" type="xsd:string">
-          <xsd:annotation>
-            <xsd:documentation>
-                        This value indicates the number of saves or revisions. The application is responsible for updating this value after each revision.
-                    </xsd:documentation>
-          </xsd:annotation>
-        </xsd:element>
-        <xsd:element name="lastModifiedBy" minOccurs="0" maxOccurs="1" type="xsd:string"/>
-        <xsd:element ref="dcterms:modified" minOccurs="0" maxOccurs="1"/>
-        <xsd:element name="contentStatus" minOccurs="0" maxOccurs="1" type="xsd:string"/>
-      </xsd:all>
-    </xsd:complexType>
-  </xsd:schema>
-  <xs:schema xmlns:pc="http://schemas.microsoft.com/office/infopath/2007/PartnerControls" xmlns:xs="http://www.w3.org/2001/XMLSchema" targetNamespace="http://schemas.microsoft.com/office/infopath/2007/PartnerControls" elementFormDefault="qualified" attributeFormDefault="unqualified">
-    <xs:element name="Person">
-      <xs:complexType>
-        <xs:sequence>
-          <xs:element ref="pc:DisplayName" minOccurs="0"/>
-          <xs:element ref="pc:AccountId" minOccurs="0"/>
-          <xs:element ref="pc:AccountType" minOccurs="0"/>
-        </xs:sequence>
-      </xs:complexType>
-    </xs:element>
-    <xs:element name="DisplayName" type="xs:string"/>
-    <xs:element name="AccountId" type="xs:string"/>
-    <xs:element name="AccountType" type="xs:string"/>
-    <xs:element name="BDCAssociatedEntity">
-      <xs:complexType>
-        <xs:sequence>
-          <xs:element ref="pc:BDCEntity" minOccurs="0" maxOccurs="unbounded"/>
-        </xs:sequence>
-        <xs:attribute ref="pc:EntityNamespace"/>
-        <xs:attribute ref="pc:EntityName"/>
-        <xs:attribute ref="pc:SystemInstanceName"/>
-        <xs:attribute ref="pc:AssociationName"/>
-      </xs:complexType>
-    </xs:element>
-    <xs:attribute name="EntityNamespace" type="xs:string"/>
-    <xs:attribute name="EntityName" type="xs:string"/>
-    <xs:attribute name="SystemInstanceName" type="xs:string"/>
-    <xs:attribute name="AssociationName" type="xs:string"/>
-    <xs:element name="BDCEntity">
-      <xs:complexType>
-        <xs:sequence>
-          <xs:element ref="pc:EntityDisplayName" minOccurs="0"/>
-          <xs:element ref="pc:EntityInstanceReference" minOccurs="0"/>
-          <xs:element ref="pc:EntityId1" minOccurs="0"/>
-          <xs:element ref="pc:EntityId2" minOccurs="0"/>
-          <xs:element ref="pc:EntityId3" minOccurs="0"/>
-          <xs:element ref="pc:EntityId4" minOccurs="0"/>
-          <xs:element ref="pc:EntityId5" minOccurs="0"/>
-        </xs:sequence>
-      </xs:complexType>
-    </xs:element>
-    <xs:element name="EntityDisplayName" type="xs:string"/>
-    <xs:element name="EntityInstanceReference" type="xs:string"/>
-    <xs:element name="EntityId1" type="xs:string"/>
-    <xs:element name="EntityId2" type="xs:string"/>
-    <xs:element name="EntityId3" type="xs:string"/>
-    <xs:element name="EntityId4" type="xs:string"/>
-    <xs:element name="EntityId5" type="xs:string"/>
-    <xs:element name="Terms">
-      <xs:complexType>
-        <xs:sequence>
-          <xs:element ref="pc:TermInfo" minOccurs="0" maxOccurs="unbounded"/>
-        </xs:sequence>
-      </xs:complexType>
-    </xs:element>
-    <xs:element name="TermInfo">
-      <xs:complexType>
-        <xs:sequence>
-          <xs:element ref="pc:TermName" minOccurs="0"/>
-          <xs:element ref="pc:TermId" minOccurs="0"/>
-        </xs:sequence>
-      </xs:complexType>
-    </xs:element>
-    <xs:element name="TermName" type="xs:string"/>
-    <xs:element name="TermId" type="xs:string"/>
-  </xs:schema>
-</ct:contentTypeSchema>
-</file>
-
-<file path=customXml/itemProps1.xml><?xml version="1.0" encoding="utf-8"?>
-<ds:datastoreItem xmlns:ds="http://schemas.openxmlformats.org/officeDocument/2006/customXml" ds:itemID="{0B548AA5-BA37-47AD-8220-6BF4EC9B0938}">
-  <ds:schemaRefs>
-    <ds:schemaRef ds:uri="http://schemas.openxmlformats.org/officeDocument/2006/bibliography"/>
-  </ds:schemaRefs>
-</ds:datastoreItem>
-</file>
-
-<file path=customXml/itemProps2.xml><?xml version="1.0" encoding="utf-8"?>
-<ds:datastoreItem xmlns:ds="http://schemas.openxmlformats.org/officeDocument/2006/customXml" ds:itemID="{59388F5F-4B89-4A7E-AD6A-970A8B60635B}">
-  <ds:schemaRefs>
-    <ds:schemaRef ds:uri="http://schemas.microsoft.com/sharepoint/v3/contenttype/forms"/>
-  </ds:schemaRefs>
-</ds:datastoreItem>
-</file>
-
-<file path=customXml/itemProps3.xml><?xml version="1.0" encoding="utf-8"?>
-<ds:datastoreItem xmlns:ds="http://schemas.openxmlformats.org/officeDocument/2006/customXml" ds:itemID="{FE489BFF-8DAF-422F-9FEF-ECFC52887579}">
-  <ds:schemaRefs>
-    <ds:schemaRef ds:uri="http://schemas.microsoft.com/office/2006/metadata/properties"/>
-    <ds:schemaRef ds:uri="http://schemas.microsoft.com/office/infopath/2007/PartnerControls"/>
-    <ds:schemaRef ds:uri="7e148860-bd70-402c-bf27-c74ddf478b75"/>
-    <ds:schemaRef ds:uri="http://schemas.microsoft.com/sharepoint/v3"/>
-  </ds:schemaRefs>
-</ds:datastoreItem>
-</file>
-
-<file path=customXml/itemProps4.xml><?xml version="1.0" encoding="utf-8"?>
-<ds:datastoreItem xmlns:ds="http://schemas.openxmlformats.org/officeDocument/2006/customXml" ds:itemID="{BBBA63AB-9BA4-431E-A428-F2A5EA2BA995}">
-  <ds:schemaRefs>
-    <ds:schemaRef ds:uri="http://schemas.microsoft.com/office/2006/metadata/contentType"/>
-    <ds:schemaRef ds:uri="http://schemas.microsoft.com/office/2006/metadata/properties/metaAttributes"/>
-    <ds:schemaRef ds:uri="http://www.w3.org/2001/XMLSchema"/>
-    <ds:schemaRef ds:uri="http://schemas.microsoft.com/office/2006/metadata/properties"/>
-    <ds:schemaRef ds:uri="http://schemas.microsoft.com/sharepoint/v3"/>
-    <ds:schemaRef ds:uri="7e148860-bd70-402c-bf27-c74ddf478b75"/>
-    <ds:schemaRef ds:uri="http://schemas.microsoft.com/office/2006/documentManagement/types"/>
-    <ds:schemaRef ds:uri="http://schemas.microsoft.com/office/infopath/2007/PartnerControls"/>
-    <ds:schemaRef ds:uri="http://schemas.openxmlformats.org/package/2006/metadata/core-properties"/>
-    <ds:schemaRef ds:uri="http://purl.org/dc/elements/1.1/"/>
-    <ds:schemaRef ds:uri="http://purl.org/dc/terms/"/>
-    <ds:schemaRef ds:uri="http://schemas.microsoft.com/internal/obd"/>
-  </ds:schemaRefs>
-</ds:datastoreItem>
 </file>
</xml_diff>

<commit_message>
Behebung Fixture-Thema und unvollständige B1-Schemaprüfung
</commit_message>
<xml_diff>
--- a/lieferungen/baldrian/Mitteilung_143_KLV_TG2015.docx
+++ b/lieferungen/baldrian/Mitteilung_143_KLV_TG2015.docx
@@ -46131,224 +46131,4 @@
     </a:ext>
   </a:extLst>
 </a:theme>
-</file>
-
-<file path=customXml/item1.xml><?xml version="1.0" encoding="utf-8"?>
-<b:Sources xmlns:b="http://schemas.openxmlformats.org/officeDocument/2006/bibliography" xmlns="http://schemas.openxmlformats.org/officeDocument/2006/bibliography" SelectedStyle="\APASixthEditionOfficeOnline.xsl" StyleName="APA" Version="6"/>
-</file>
-
-<file path=customXml/item2.xml><?xml version="1.0" encoding="utf-8"?>
-<?mso-contentType ?>
-<FormTemplates xmlns="http://schemas.microsoft.com/sharepoint/v3/contenttype/forms">
-  <Display>DocumentLibraryForm</Display>
-  <Edit>DocumentLibraryForm</Edit>
-  <New>DocumentLibraryForm</New>
-</FormTemplates>
-</file>
-
-<file path=customXml/item3.xml><?xml version="1.0" encoding="utf-8"?>
-<p:properties xmlns:p="http://schemas.microsoft.com/office/2006/metadata/properties" xmlns:xsi="http://www.w3.org/2001/XMLSchema-instance" xmlns:pc="http://schemas.microsoft.com/office/infopath/2007/PartnerControls">
-  <documentManagement>
-    <Kategorie xmlns="7e148860-bd70-402c-bf27-c74ddf478b75">White-Box-Modelle</Kategorie>
-    <PublishingExpirationDate xmlns="http://schemas.microsoft.com/sharepoint/v3" xsi:nil="true"/>
-    <PublishingStartDate xmlns="http://schemas.microsoft.com/sharepoint/v3" xsi:nil="true"/>
-  </documentManagement>
-</p:properties>
-</file>
-
-<file path=customXml/item4.xml><?xml version="1.0" encoding="utf-8"?>
-<ct:contentTypeSchema xmlns:ct="http://schemas.microsoft.com/office/2006/metadata/contentType" xmlns:ma="http://schemas.microsoft.com/office/2006/metadata/properties/metaAttributes" ct:_="" ma:_="" ma:contentTypeName="Dokument" ma:contentTypeID="0x0101009670652FF643BB4087D0D4458642B0D2" ma:contentTypeVersion="4" ma:contentTypeDescription="Ein neues Dokument erstellen." ma:contentTypeScope="" ma:versionID="97ec7617939de4e5f17fc07f9f160333">
-  <xsd:schema xmlns:xsd="http://www.w3.org/2001/XMLSchema" xmlns:xs="http://www.w3.org/2001/XMLSchema" xmlns:p="http://schemas.microsoft.com/office/2006/metadata/properties" xmlns:ns1="http://schemas.microsoft.com/sharepoint/v3" xmlns:ns2="7e148860-bd70-402c-bf27-c74ddf478b75" targetNamespace="http://schemas.microsoft.com/office/2006/metadata/properties" ma:root="true" ma:fieldsID="899ced930f44085f47fb482023dc2c48" ns1:_="" ns2:_="">
-    <xsd:import namespace="http://schemas.microsoft.com/sharepoint/v3"/>
-    <xsd:import namespace="7e148860-bd70-402c-bf27-c74ddf478b75"/>
-    <xsd:element name="properties">
-      <xsd:complexType>
-        <xsd:sequence>
-          <xsd:element name="documentManagement">
-            <xsd:complexType>
-              <xsd:all>
-                <xsd:element ref="ns1:PublishingStartDate" minOccurs="0"/>
-                <xsd:element ref="ns1:PublishingExpirationDate" minOccurs="0"/>
-                <xsd:element ref="ns2:Kategorie"/>
-              </xsd:all>
-            </xsd:complexType>
-          </xsd:element>
-        </xsd:sequence>
-      </xsd:complexType>
-    </xsd:element>
-  </xsd:schema>
-  <xsd:schema xmlns:xsd="http://www.w3.org/2001/XMLSchema" xmlns:xs="http://www.w3.org/2001/XMLSchema" xmlns:dms="http://schemas.microsoft.com/office/2006/documentManagement/types" xmlns:pc="http://schemas.microsoft.com/office/infopath/2007/PartnerControls" targetNamespace="http://schemas.microsoft.com/sharepoint/v3" elementFormDefault="qualified">
-    <xsd:import namespace="http://schemas.microsoft.com/office/2006/documentManagement/types"/>
-    <xsd:import namespace="http://schemas.microsoft.com/office/infopath/2007/PartnerControls"/>
-    <xsd:element name="PublishingStartDate" ma:index="8" nillable="true" ma:displayName="Geplantes Startdatum" ma:description="Geplantes Startdatum ist eine Websitespalte, die über das Feature zum Veröffentlichen erstellt wird. Es wird zur Angabe des Datums und der Uhrzeit verwendet, wann diese Seite Besuchern zum ersten Mal angezeigt wird." ma:hidden="true" ma:internalName="PublishingStartDate">
-      <xsd:simpleType>
-        <xsd:restriction base="dms:Unknown"/>
-      </xsd:simpleType>
-    </xsd:element>
-    <xsd:element name="PublishingExpirationDate" ma:index="9" nillable="true" ma:displayName="Geplantes Enddatum" ma:description="Geplantes Enddatum ist eine Websitespalte, die über das Feature zum Veröffentlichen erstellt wird. Es wird zur Angabe des Datums und der Uhrzeit verwendet, wann diese Seite Besuchern nicht mehr angezeigt wird." ma:hidden="true" ma:internalName="PublishingExpirationDate">
-      <xsd:simpleType>
-        <xsd:restriction base="dms:Unknown"/>
-      </xsd:simpleType>
-    </xsd:element>
-  </xsd:schema>
-  <xsd:schema xmlns:xsd="http://www.w3.org/2001/XMLSchema" xmlns:xs="http://www.w3.org/2001/XMLSchema" xmlns:dms="http://schemas.microsoft.com/office/2006/documentManagement/types" xmlns:pc="http://schemas.microsoft.com/office/infopath/2007/PartnerControls" targetNamespace="7e148860-bd70-402c-bf27-c74ddf478b75" elementFormDefault="qualified">
-    <xsd:import namespace="http://schemas.microsoft.com/office/2006/documentManagement/types"/>
-    <xsd:import namespace="http://schemas.microsoft.com/office/infopath/2007/PartnerControls"/>
-    <xsd:element name="Kategorie" ma:index="10" ma:displayName="Kategorie" ma:default="Aktuell in Bearbeitung" ma:format="Dropdown" ma:internalName="Kategorie">
-      <xsd:simpleType>
-        <xsd:union memberTypes="dms:Text">
-          <xsd:simpleType>
-            <xsd:restriction base="dms:Choice">
-              <xsd:enumeration value="Aktuell in Bearbeitung"/>
-              <xsd:enumeration value="Verabschiedete Arbeitsergebnisse"/>
-              <xsd:enumeration value="Nützliche Dokumente"/>
-            </xsd:restriction>
-          </xsd:simpleType>
-        </xsd:union>
-      </xsd:simpleType>
-    </xsd:element>
-  </xsd:schema>
-  <xsd:schema xmlns="http://schemas.openxmlformats.org/package/2006/metadata/core-properties" xmlns:xsd="http://www.w3.org/2001/XMLSchema" xmlns:xsi="http://www.w3.org/2001/XMLSchema-instance" xmlns:dc="http://purl.org/dc/elements/1.1/" xmlns:dcterms="http://purl.org/dc/terms/" xmlns:odoc="http://schemas.microsoft.com/internal/obd" targetNamespace="http://schemas.openxmlformats.org/package/2006/metadata/core-properties" elementFormDefault="qualified" attributeFormDefault="unqualified" blockDefault="#all">
-    <xsd:import namespace="http://purl.org/dc/elements/1.1/" schemaLocation="http://dublincore.org/schemas/xmls/qdc/2003/04/02/dc.xsd"/>
-    <xsd:import namespace="http://purl.org/dc/terms/" schemaLocation="http://dublincore.org/schemas/xmls/qdc/2003/04/02/dcterms.xsd"/>
-    <xsd:element name="coreProperties" type="CT_coreProperties"/>
-    <xsd:complexType name="CT_coreProperties">
-      <xsd:all>
-        <xsd:element ref="dc:creator" minOccurs="0" maxOccurs="1"/>
-        <xsd:element ref="dcterms:created" minOccurs="0" maxOccurs="1"/>
-        <xsd:element ref="dc:identifier" minOccurs="0" maxOccurs="1"/>
-        <xsd:element name="contentType" minOccurs="0" maxOccurs="1" type="xsd:string" ma:index="0" ma:displayName="Inhaltstyp"/>
-        <xsd:element ref="dc:title" minOccurs="0" maxOccurs="1" ma:index="4" ma:displayName="Titel"/>
-        <xsd:element ref="dc:subject" minOccurs="0" maxOccurs="1"/>
-        <xsd:element ref="dc:description" minOccurs="0" maxOccurs="1"/>
-        <xsd:element name="keywords" minOccurs="0" maxOccurs="1" type="xsd:string"/>
-        <xsd:element ref="dc:language" minOccurs="0" maxOccurs="1"/>
-        <xsd:element name="category" minOccurs="0" maxOccurs="1" type="xsd:string"/>
-        <xsd:element name="version" minOccurs="0" maxOccurs="1" type="xsd:string"/>
-        <xsd:element name="revision" minOccurs="0" maxOccurs="1" type="xsd:string">
-          <xsd:annotation>
-            <xsd:documentation>
-                        This value indicates the number of saves or revisions. The application is responsible for updating this value after each revision.
-                    </xsd:documentation>
-          </xsd:annotation>
-        </xsd:element>
-        <xsd:element name="lastModifiedBy" minOccurs="0" maxOccurs="1" type="xsd:string"/>
-        <xsd:element ref="dcterms:modified" minOccurs="0" maxOccurs="1"/>
-        <xsd:element name="contentStatus" minOccurs="0" maxOccurs="1" type="xsd:string"/>
-      </xsd:all>
-    </xsd:complexType>
-  </xsd:schema>
-  <xs:schema xmlns:pc="http://schemas.microsoft.com/office/infopath/2007/PartnerControls" xmlns:xs="http://www.w3.org/2001/XMLSchema" targetNamespace="http://schemas.microsoft.com/office/infopath/2007/PartnerControls" elementFormDefault="qualified" attributeFormDefault="unqualified">
-    <xs:element name="Person">
-      <xs:complexType>
-        <xs:sequence>
-          <xs:element ref="pc:DisplayName" minOccurs="0"/>
-          <xs:element ref="pc:AccountId" minOccurs="0"/>
-          <xs:element ref="pc:AccountType" minOccurs="0"/>
-        </xs:sequence>
-      </xs:complexType>
-    </xs:element>
-    <xs:element name="DisplayName" type="xs:string"/>
-    <xs:element name="AccountId" type="xs:string"/>
-    <xs:element name="AccountType" type="xs:string"/>
-    <xs:element name="BDCAssociatedEntity">
-      <xs:complexType>
-        <xs:sequence>
-          <xs:element ref="pc:BDCEntity" minOccurs="0" maxOccurs="unbounded"/>
-        </xs:sequence>
-        <xs:attribute ref="pc:EntityNamespace"/>
-        <xs:attribute ref="pc:EntityName"/>
-        <xs:attribute ref="pc:SystemInstanceName"/>
-        <xs:attribute ref="pc:AssociationName"/>
-      </xs:complexType>
-    </xs:element>
-    <xs:attribute name="EntityNamespace" type="xs:string"/>
-    <xs:attribute name="EntityName" type="xs:string"/>
-    <xs:attribute name="SystemInstanceName" type="xs:string"/>
-    <xs:attribute name="AssociationName" type="xs:string"/>
-    <xs:element name="BDCEntity">
-      <xs:complexType>
-        <xs:sequence>
-          <xs:element ref="pc:EntityDisplayName" minOccurs="0"/>
-          <xs:element ref="pc:EntityInstanceReference" minOccurs="0"/>
-          <xs:element ref="pc:EntityId1" minOccurs="0"/>
-          <xs:element ref="pc:EntityId2" minOccurs="0"/>
-          <xs:element ref="pc:EntityId3" minOccurs="0"/>
-          <xs:element ref="pc:EntityId4" minOccurs="0"/>
-          <xs:element ref="pc:EntityId5" minOccurs="0"/>
-        </xs:sequence>
-      </xs:complexType>
-    </xs:element>
-    <xs:element name="EntityDisplayName" type="xs:string"/>
-    <xs:element name="EntityInstanceReference" type="xs:string"/>
-    <xs:element name="EntityId1" type="xs:string"/>
-    <xs:element name="EntityId2" type="xs:string"/>
-    <xs:element name="EntityId3" type="xs:string"/>
-    <xs:element name="EntityId4" type="xs:string"/>
-    <xs:element name="EntityId5" type="xs:string"/>
-    <xs:element name="Terms">
-      <xs:complexType>
-        <xs:sequence>
-          <xs:element ref="pc:TermInfo" minOccurs="0" maxOccurs="unbounded"/>
-        </xs:sequence>
-      </xs:complexType>
-    </xs:element>
-    <xs:element name="TermInfo">
-      <xs:complexType>
-        <xs:sequence>
-          <xs:element ref="pc:TermName" minOccurs="0"/>
-          <xs:element ref="pc:TermId" minOccurs="0"/>
-        </xs:sequence>
-      </xs:complexType>
-    </xs:element>
-    <xs:element name="TermName" type="xs:string"/>
-    <xs:element name="TermId" type="xs:string"/>
-  </xs:schema>
-</ct:contentTypeSchema>
-</file>
-
-<file path=customXml/itemProps1.xml><?xml version="1.0" encoding="utf-8"?>
-<ds:datastoreItem xmlns:ds="http://schemas.openxmlformats.org/officeDocument/2006/customXml" ds:itemID="{0B548AA5-BA37-47AD-8220-6BF4EC9B0938}">
-  <ds:schemaRefs>
-    <ds:schemaRef ds:uri="http://schemas.openxmlformats.org/officeDocument/2006/bibliography"/>
-  </ds:schemaRefs>
-</ds:datastoreItem>
-</file>
-
-<file path=customXml/itemProps2.xml><?xml version="1.0" encoding="utf-8"?>
-<ds:datastoreItem xmlns:ds="http://schemas.openxmlformats.org/officeDocument/2006/customXml" ds:itemID="{59388F5F-4B89-4A7E-AD6A-970A8B60635B}">
-  <ds:schemaRefs>
-    <ds:schemaRef ds:uri="http://schemas.microsoft.com/sharepoint/v3/contenttype/forms"/>
-  </ds:schemaRefs>
-</ds:datastoreItem>
-</file>
-
-<file path=customXml/itemProps3.xml><?xml version="1.0" encoding="utf-8"?>
-<ds:datastoreItem xmlns:ds="http://schemas.openxmlformats.org/officeDocument/2006/customXml" ds:itemID="{FE489BFF-8DAF-422F-9FEF-ECFC52887579}">
-  <ds:schemaRefs>
-    <ds:schemaRef ds:uri="http://schemas.microsoft.com/office/2006/metadata/properties"/>
-    <ds:schemaRef ds:uri="http://schemas.microsoft.com/office/infopath/2007/PartnerControls"/>
-    <ds:schemaRef ds:uri="7e148860-bd70-402c-bf27-c74ddf478b75"/>
-    <ds:schemaRef ds:uri="http://schemas.microsoft.com/sharepoint/v3"/>
-  </ds:schemaRefs>
-</ds:datastoreItem>
-</file>
-
-<file path=customXml/itemProps4.xml><?xml version="1.0" encoding="utf-8"?>
-<ds:datastoreItem xmlns:ds="http://schemas.openxmlformats.org/officeDocument/2006/customXml" ds:itemID="{BBBA63AB-9BA4-431E-A428-F2A5EA2BA995}">
-  <ds:schemaRefs>
-    <ds:schemaRef ds:uri="http://schemas.microsoft.com/office/2006/metadata/contentType"/>
-    <ds:schemaRef ds:uri="http://schemas.microsoft.com/office/2006/metadata/properties/metaAttributes"/>
-    <ds:schemaRef ds:uri="http://www.w3.org/2001/XMLSchema"/>
-    <ds:schemaRef ds:uri="http://schemas.microsoft.com/office/2006/metadata/properties"/>
-    <ds:schemaRef ds:uri="http://schemas.microsoft.com/sharepoint/v3"/>
-    <ds:schemaRef ds:uri="7e148860-bd70-402c-bf27-c74ddf478b75"/>
-    <ds:schemaRef ds:uri="http://schemas.microsoft.com/office/2006/documentManagement/types"/>
-    <ds:schemaRef ds:uri="http://schemas.microsoft.com/office/infopath/2007/PartnerControls"/>
-    <ds:schemaRef ds:uri="http://schemas.openxmlformats.org/package/2006/metadata/core-properties"/>
-    <ds:schemaRef ds:uri="http://purl.org/dc/elements/1.1/"/>
-    <ds:schemaRef ds:uri="http://purl.org/dc/terms/"/>
-    <ds:schemaRef ds:uri="http://schemas.microsoft.com/internal/obd"/>
-  </ds:schemaRefs>
-</ds:datastoreItem>
 </file>
</xml_diff>